<commit_message>
Update prayer-vigil content for maturandi 2026
Refines index.html with updated introduction and prayers, adds new sections for "Padre nostro" and "Consegna dei doni," and updates supporting documents.
</commit_message>
<xml_diff>
--- a/Momento_di_preghiera_maturandi_2026.docx
+++ b/Momento_di_preghiera_maturandi_2026.docx
@@ -83,67 +83,7 @@
         <w:t xml:space="preserve">Celebrante: </w:t>
       </w:r>
       <w:r>
-        <w:t xml:space="preserve">Buonasera a tutti, e benvenuti. Sono contento che questa sera siate qui.</w:t>
-      </w:r>
-    </w:p>
-    <w:p>
-      <w:pPr>
-        <w:spacing w:after="140" w:before="0" w:line="288" w:lineRule="auto"/>
-        <w:jc w:val="both"/>
-      </w:pPr>
-      <w:r>
-        <w:rPr>
-          <w:b w:val="false"/>
-          <w:bCs w:val="false"/>
-          <w:i w:val="false"/>
-          <w:iCs w:val="false"/>
-        </w:rPr>
-        <w:t xml:space="preserve">Vi siete radunati alla vigilia di un giorno importante: domani comincia l’Esame di Stato, quella che tutti chiamiamo “la maturità”. È normale portare nel cuore un po’ di emozione, di stanchezza e forse anche un po’ di paura. Proprio per questo ci siamo dati appuntamento qui.</w:t>
-      </w:r>
-    </w:p>
-    <w:p>
-      <w:pPr>
-        <w:spacing w:after="140" w:before="0" w:line="288" w:lineRule="auto"/>
-        <w:jc w:val="both"/>
-      </w:pPr>
-      <w:r>
-        <w:rPr>
-          <w:b w:val="false"/>
-          <w:bCs w:val="false"/>
-          <w:i w:val="false"/>
-          <w:iCs w:val="false"/>
-        </w:rPr>
-        <w:t xml:space="preserve">Qualcuno di voi forse entra in una chiesa per la prima volta, o quasi: non preoccupatevi, non c’è nulla da sapere a memoria e nulla da temere. Pregare, in fondo, è semplicemente fermarsi un momento, fare un po’ di silenzio dentro di sé e aprire il cuore. Stasera non siete soli: siamo qui insieme, e crediamo che Dio ci accolga così come siamo, con i nostri sogni e le nostre incertezze.</w:t>
-      </w:r>
-    </w:p>
-    <w:p>
-      <w:pPr>
-        <w:spacing w:after="140" w:before="0" w:line="288" w:lineRule="auto"/>
-        <w:jc w:val="both"/>
-      </w:pPr>
-      <w:r>
-        <w:rPr>
-          <w:b w:val="false"/>
-          <w:bCs w:val="false"/>
-          <w:i w:val="false"/>
-          <w:iCs w:val="false"/>
-        </w:rPr>
-        <w:t xml:space="preserve">L’estate scorsa, a Roma, più di un milione di ragazzi e ragazze della vostra età si sono ritrovati per il Giubileo dei Giovani. A loro Papa Leone XIV ha rivolto parole che questa sera affidiamo anche a voi: “Aspirate a cose grandi, alla santità, ovunque siate. Non accontentatevi di meno”. E davanti alla fatica di dover scegliere, ha ricordato che “il coraggio per scegliere viene dall’amore”, quell’amore di Dio che non ci lascia mai soli.</w:t>
-      </w:r>
-    </w:p>
-    <w:p>
-      <w:pPr>
-        <w:spacing w:after="140" w:before="0" w:line="288" w:lineRule="auto"/>
-        <w:jc w:val="both"/>
-      </w:pPr>
-      <w:r>
-        <w:rPr>
-          <w:b w:val="false"/>
-          <w:bCs w:val="false"/>
-          <w:i w:val="false"/>
-          <w:iCs w:val="false"/>
-        </w:rPr>
-        <w:t xml:space="preserve">La maturità che vi attende non è soltanto un esame: è l’inizio di un cammino in cui sarete chiamati a scegliere, a crescere, a diventare, come ha detto il Papa ai giovani, “sale della terra e luce del mondo”. Affidiamo allora questo passo al Signore.</w:t>
+        <w:t>Carissimi giovani maturandi, ci incontriamo alla vigilia di un giorno importante: domani comincia l’Esame di Stato, quella che tutti chiamiamo “la maturità”. È normale portare nel cuore un po’ di emozione, di stanchezza e forse anche un po’ di paura. Proprio per questo ci siamo dati appuntamento qui: per dirvi che non siete soli perché noi facciamo il tifo per voi e il Signore vuole accompagnarvi con la sua Benedizione.</w:t>
       </w:r>
     </w:p>
     <w:p>
@@ -276,41 +216,6 @@
     </w:p>
     <w:p>
       <w:pPr>
-        <w:spacing w:after="60" w:before="0" w:line="288" w:lineRule="auto"/>
-        <w:jc w:val="both"/>
-      </w:pPr>
-      <w:r>
-        <w:rPr>
-          <w:b/>
-          <w:bCs/>
-          <w:color w:val="7B2D26"/>
-        </w:rPr>
-        <w:t xml:space="preserve">Celebrante: </w:t>
-      </w:r>
-      <w:r>
-        <w:t xml:space="preserve">Eleviamo ora insieme al Signore la nostra preghiera. Sono i maturandi stessi a dare voce a ciò che portano nel cuore. Dopo ogni invocazione, tutti insieme rispondiamo:</w:t>
-      </w:r>
-    </w:p>
-    <w:p>
-      <w:pPr>
-        <w:spacing w:after="180" w:before="0" w:line="288" w:lineRule="auto"/>
-        <w:jc w:val="center"/>
-      </w:pPr>
-      <w:r>
-        <w:rPr>
-          <w:b/>
-          <w:bCs/>
-          <w:i/>
-          <w:iCs/>
-          <w:color w:val="7B2D26"/>
-          <w:sz w:val="26"/>
-          <w:szCs w:val="26"/>
-        </w:rPr>
-        <w:t xml:space="preserve">Ascoltaci, Signore.</w:t>
-      </w:r>
-    </w:p>
-    <w:p>
-      <w:pPr>
         <w:spacing w:after="40" w:before="60" w:line="288" w:lineRule="auto"/>
         <w:jc w:val="both"/>
       </w:pPr>
@@ -325,37 +230,6 @@
       <w:r>
         <w:t xml:space="preserve">Signore Gesù, fra pochi giorni si concluderà una fase importante della vita di noi giovani maturandi, e intraprenderemo un nuovo cammino che ci porterà ad entrare nel mondo adulto: a dover scegliere e prendere decisioni importanti, ad essere sempre più protagonisti nella gestione della nostra vita. È impensabile attraversare questa fase così bella e importante, ma terribilmente delicata, senza la tua presenza e il tuo sostegno.</w:t>
       </w:r>
-      <w:r>
-        <w:rPr>
-          <w:b/>
-          <w:bCs/>
-        </w:rPr>
-        <w:t xml:space="preserve"> Preghiamo.</w:t>
-      </w:r>
-    </w:p>
-    <w:p>
-      <w:pPr>
-        <w:spacing w:after="180" w:before="20" w:line="288" w:lineRule="auto"/>
-        <w:ind w:left="360"/>
-        <w:jc w:val="left"/>
-      </w:pPr>
-      <w:r>
-        <w:rPr>
-          <w:b/>
-          <w:bCs/>
-          <w:color w:val="7B2D26"/>
-        </w:rPr>
-        <w:t xml:space="preserve">Tutti: </w:t>
-      </w:r>
-      <w:r>
-        <w:rPr>
-          <w:b/>
-          <w:bCs/>
-          <w:i/>
-          <w:iCs/>
-        </w:rPr>
-        <w:t xml:space="preserve">Ascoltaci, Signore.</w:t>
-      </w:r>
     </w:p>
     <w:p>
       <w:pPr>
@@ -373,37 +247,6 @@
       <w:r>
         <w:t xml:space="preserve">Preghiamo affinché la “maturità” scolastica non sia solo il nome di una tappa, di un esame, della fine di un ciclo di studi, ma apra il cuore di noi giovani ad un nuovo modo di vivere, come persone davvero mature interiormente.</w:t>
       </w:r>
-      <w:r>
-        <w:rPr>
-          <w:b/>
-          <w:bCs/>
-        </w:rPr>
-        <w:t xml:space="preserve"> Preghiamo.</w:t>
-      </w:r>
-    </w:p>
-    <w:p>
-      <w:pPr>
-        <w:spacing w:after="180" w:before="20" w:line="288" w:lineRule="auto"/>
-        <w:ind w:left="360"/>
-        <w:jc w:val="left"/>
-      </w:pPr>
-      <w:r>
-        <w:rPr>
-          <w:b/>
-          <w:bCs/>
-          <w:color w:val="7B2D26"/>
-        </w:rPr>
-        <w:t xml:space="preserve">Tutti: </w:t>
-      </w:r>
-      <w:r>
-        <w:rPr>
-          <w:b/>
-          <w:bCs/>
-          <w:i/>
-          <w:iCs/>
-        </w:rPr>
-        <w:t xml:space="preserve">Ascoltaci, Signore.</w:t>
-      </w:r>
     </w:p>
     <w:p>
       <w:pPr>
@@ -421,37 +264,6 @@
       <w:r>
         <w:t xml:space="preserve">Signore, ti chiediamo di essere luce e guida per noi giovani nel cammino che stiamo per intraprendere. Donaci la saggezza per affrontare le sfide e la forza per superare gli ostacoli. Fa’ che possiamo trovare in Te un punto di riferimento costante e sicuro.</w:t>
       </w:r>
-      <w:r>
-        <w:rPr>
-          <w:b/>
-          <w:bCs/>
-        </w:rPr>
-        <w:t xml:space="preserve"> Preghiamo.</w:t>
-      </w:r>
-    </w:p>
-    <w:p>
-      <w:pPr>
-        <w:spacing w:after="180" w:before="20" w:line="288" w:lineRule="auto"/>
-        <w:ind w:left="360"/>
-        <w:jc w:val="left"/>
-      </w:pPr>
-      <w:r>
-        <w:rPr>
-          <w:b/>
-          <w:bCs/>
-          <w:color w:val="7B2D26"/>
-        </w:rPr>
-        <w:t xml:space="preserve">Tutti: </w:t>
-      </w:r>
-      <w:r>
-        <w:rPr>
-          <w:b/>
-          <w:bCs/>
-          <w:i/>
-          <w:iCs/>
-        </w:rPr>
-        <w:t xml:space="preserve">Ascoltaci, Signore.</w:t>
-      </w:r>
     </w:p>
     <w:p>
       <w:pPr>
@@ -469,37 +281,6 @@
       <w:r>
         <w:t xml:space="preserve">Signore, preghiamo affinché ognuno di noi maturandi possa scoprire e valorizzare i propri talenti. Aiutaci a coltivare con passione i doni ricevuti, affinché possiamo metterli al servizio del bene comune e della nostra crescita personale e professionale.</w:t>
       </w:r>
-      <w:r>
-        <w:rPr>
-          <w:b/>
-          <w:bCs/>
-        </w:rPr>
-        <w:t xml:space="preserve"> Preghiamo.</w:t>
-      </w:r>
-    </w:p>
-    <w:p>
-      <w:pPr>
-        <w:spacing w:after="180" w:before="20" w:line="288" w:lineRule="auto"/>
-        <w:ind w:left="360"/>
-        <w:jc w:val="left"/>
-      </w:pPr>
-      <w:r>
-        <w:rPr>
-          <w:b/>
-          <w:bCs/>
-          <w:color w:val="7B2D26"/>
-        </w:rPr>
-        <w:t xml:space="preserve">Tutti: </w:t>
-      </w:r>
-      <w:r>
-        <w:rPr>
-          <w:b/>
-          <w:bCs/>
-          <w:i/>
-          <w:iCs/>
-        </w:rPr>
-        <w:t xml:space="preserve">Ascoltaci, Signore.</w:t>
-      </w:r>
     </w:p>
     <w:p>
       <w:pPr>
@@ -517,37 +298,6 @@
       <w:r>
         <w:t xml:space="preserve">Signore, accompagna noi giovani nel nostro percorso di vita, proteggici e sostienici nelle scelte che faremo. Fa’ che possiamo avere il coraggio di seguire i nostri sogni, rimanendo sempre fedeli ai valori del Vangelo e alla Tua parola.</w:t>
       </w:r>
-      <w:r>
-        <w:rPr>
-          <w:b/>
-          <w:bCs/>
-        </w:rPr>
-        <w:t xml:space="preserve"> Preghiamo.</w:t>
-      </w:r>
-    </w:p>
-    <w:p>
-      <w:pPr>
-        <w:spacing w:after="180" w:before="20" w:line="288" w:lineRule="auto"/>
-        <w:ind w:left="360"/>
-        <w:jc w:val="left"/>
-      </w:pPr>
-      <w:r>
-        <w:rPr>
-          <w:b/>
-          <w:bCs/>
-          <w:color w:val="7B2D26"/>
-        </w:rPr>
-        <w:t xml:space="preserve">Tutti: </w:t>
-      </w:r>
-      <w:r>
-        <w:rPr>
-          <w:b/>
-          <w:bCs/>
-          <w:i/>
-          <w:iCs/>
-        </w:rPr>
-        <w:t xml:space="preserve">Ascoltaci, Signore.</w:t>
-      </w:r>
     </w:p>
     <w:p>
       <w:pPr>
@@ -565,37 +315,6 @@
       <w:r>
         <w:t xml:space="preserve">Signore Gesù, ci rivolgiamo a Te in questo momento cruciale della nostra vita. Ti chiediamo di illuminare il nostro cammino, di darci la forza e il coraggio necessari per affrontare gli esami e tutte le sfide future. Aiutaci a crescere non solo come studenti, ma anche come persone, seguendo sempre i tuoi insegnamenti.</w:t>
       </w:r>
-      <w:r>
-        <w:rPr>
-          <w:b/>
-          <w:bCs/>
-        </w:rPr>
-        <w:t xml:space="preserve"> Preghiamo.</w:t>
-      </w:r>
-    </w:p>
-    <w:p>
-      <w:pPr>
-        <w:spacing w:after="180" w:before="20" w:line="288" w:lineRule="auto"/>
-        <w:ind w:left="360"/>
-        <w:jc w:val="left"/>
-      </w:pPr>
-      <w:r>
-        <w:rPr>
-          <w:b/>
-          <w:bCs/>
-          <w:color w:val="7B2D26"/>
-        </w:rPr>
-        <w:t xml:space="preserve">Tutti: </w:t>
-      </w:r>
-      <w:r>
-        <w:rPr>
-          <w:b/>
-          <w:bCs/>
-          <w:i/>
-          <w:iCs/>
-        </w:rPr>
-        <w:t xml:space="preserve">Ascoltaci, Signore.</w:t>
-      </w:r>
     </w:p>
     <w:p>
       <w:pPr>
@@ -612,37 +331,6 @@
       </w:r>
       <w:r>
         <w:t xml:space="preserve">Signore, ti preghiamo di guidarci mentre ci prepariamo a concludere questo importante capitolo della nostra vita scolastica. Fa’ che possiamo affrontare con serenità e determinazione gli esami, confidando nel nostro impegno e nella Tua protezione. Donaci la capacità di fare scelte sagge e di seguire il cammino che hai preparato per noi.</w:t>
-      </w:r>
-      <w:r>
-        <w:rPr>
-          <w:b/>
-          <w:bCs/>
-        </w:rPr>
-        <w:t xml:space="preserve"> Preghiamo.</w:t>
-      </w:r>
-    </w:p>
-    <w:p>
-      <w:pPr>
-        <w:spacing w:after="180" w:before="20" w:line="288" w:lineRule="auto"/>
-        <w:ind w:left="360"/>
-        <w:jc w:val="left"/>
-      </w:pPr>
-      <w:r>
-        <w:rPr>
-          <w:b/>
-          <w:bCs/>
-          <w:color w:val="7B2D26"/>
-        </w:rPr>
-        <w:t xml:space="preserve">Tutti: </w:t>
-      </w:r>
-      <w:r>
-        <w:rPr>
-          <w:b/>
-          <w:bCs/>
-          <w:i/>
-          <w:iCs/>
-        </w:rPr>
-        <w:t xml:space="preserve">Ascoltaci, Signore.</w:t>
       </w:r>
     </w:p>
     <w:p>
@@ -666,21 +354,6 @@
     </w:p>
     <w:p>
       <w:pPr>
-        <w:spacing w:after="120" w:before="0" w:line="288" w:lineRule="auto"/>
-        <w:jc w:val="both"/>
-      </w:pPr>
-      <w:r>
-        <w:rPr>
-          <w:b w:val="false"/>
-          <w:bCs w:val="false"/>
-          <w:i/>
-          <w:iCs/>
-        </w:rPr>
-        <w:t xml:space="preserve">Si può recitare insieme.</w:t>
-      </w:r>
-    </w:p>
-    <w:p>
-      <w:pPr>
         <w:spacing w:after="40" w:line="276" w:lineRule="auto"/>
         <w:jc w:val="left"/>
       </w:pPr>
@@ -721,7 +394,7 @@
         <w:jc w:val="left"/>
       </w:pPr>
       <w:r>
-        <w:t xml:space="preserve">quanta ansietà accompagni l’impegno dello studio (degli esami)</w:t>
+        <w:t>quanta ansietà accompagni l’impegno dello studio e degli esami</w:t>
       </w:r>
     </w:p>
     <w:p>
@@ -845,6 +518,25 @@
           <w:sz w:val="26"/>
           <w:szCs w:val="26"/>
         </w:rPr>
+        <w:t>Padre nostro</w:t>
+      </w:r>
+    </w:p>
+    <w:p>
+      <w:pPr>
+        <w:pBdr>
+          <w:bottom w:val="single" w:color="7B2D26" w:sz="6" w:space="4"/>
+        </w:pBdr>
+        <w:spacing w:after="160" w:before="320"/>
+      </w:pPr>
+      <w:r>
+        <w:rPr>
+          <w:b/>
+          <w:bCs/>
+          <w:caps/>
+          <w:color w:val="7B2D26"/>
+          <w:sz w:val="26"/>
+          <w:szCs w:val="26"/>
+        </w:rPr>
         <w:t xml:space="preserve">Benedizione finale</w:t>
       </w:r>
     </w:p>
@@ -956,6 +648,25 @@
       </w:r>
       <w:r>
         <w:t xml:space="preserve">Andate in pace, e in bocca al lupo per i vostri esami.</w:t>
+      </w:r>
+    </w:p>
+    <w:p>
+      <w:pPr>
+        <w:pBdr>
+          <w:bottom w:val="single" w:color="7B2D26" w:sz="6" w:space="4"/>
+        </w:pBdr>
+        <w:spacing w:after="160" w:before="320"/>
+      </w:pPr>
+      <w:r>
+        <w:rPr>
+          <w:b/>
+          <w:bCs/>
+          <w:caps/>
+          <w:color w:val="7B2D26"/>
+          <w:sz w:val="26"/>
+          <w:szCs w:val="26"/>
+        </w:rPr>
+        <w:t>Consegna dei doni</w:t>
       </w:r>
     </w:p>
     <w:sectPr>

</xml_diff>